<commit_message>
Ultimate React Course: Complete section 17
</commit_message>
<xml_diff>
--- a/3.React/UltimateReactCourse/Document/3.docx
+++ b/3.React/UltimateReactCourse/Document/3.docx
@@ -1,6 +1,6 @@
 
 <file path=word/document.xml><?xml version="1.0" encoding="utf-8"?>
-<w:document xmlns:wpc="http://schemas.microsoft.com/office/word/2010/wordprocessingCanvas" xmlns:cx="http://schemas.microsoft.com/office/drawing/2014/chartex" xmlns:cx1="http://schemas.microsoft.com/office/drawing/2015/9/8/chartex" xmlns:cx2="http://schemas.microsoft.com/office/drawing/2015/10/21/chartex" xmlns:cx3="http://schemas.microsoft.com/office/drawing/2016/5/9/chartex" xmlns:cx4="http://schemas.microsoft.com/office/drawing/2016/5/10/chartex" xmlns:cx5="http://schemas.microsoft.com/office/drawing/2016/5/11/chartex" xmlns:cx6="http://schemas.microsoft.com/office/drawing/2016/5/12/chartex" xmlns:cx7="http://schemas.microsoft.com/office/drawing/2016/5/13/chartex" xmlns:cx8="http://schemas.microsoft.com/office/drawing/2016/5/14/chartex" xmlns:mc="http://schemas.openxmlformats.org/markup-compatibility/2006" xmlns:aink="http://schemas.microsoft.com/office/drawing/2016/ink" xmlns:am3d="http://schemas.microsoft.com/office/drawing/2017/model3d" xmlns:o="urn:schemas-microsoft-com:office:office" xmlns:oel="http://schemas.microsoft.com/office/2019/extlst" xmlns:r="http://schemas.openxmlformats.org/officeDocument/2006/relationships" xmlns:m="http://schemas.openxmlformats.org/officeDocument/2006/math" xmlns:v="urn:schemas-microsoft-com:vml" xmlns:wp14="http://schemas.microsoft.com/office/word/2010/wordprocessingDrawing" xmlns:wp="http://schemas.openxmlformats.org/drawingml/2006/wordprocessingDrawing" xmlns:w10="urn:schemas-microsoft-com:office:word" xmlns:w="http://schemas.openxmlformats.org/wordprocessingml/2006/main" xmlns:w14="http://schemas.microsoft.com/office/word/2010/wordml" xmlns:w15="http://schemas.microsoft.com/office/word/2012/wordml" xmlns:w16cex="http://schemas.microsoft.com/office/word/2018/wordml/cex" xmlns:w16cid="http://schemas.microsoft.com/office/word/2016/wordml/cid" xmlns:w16="http://schemas.microsoft.com/office/word/2018/wordml" xmlns:w16du="http://schemas.microsoft.com/office/word/2023/wordml/word16du" xmlns:w16sdtdh="http://schemas.microsoft.com/office/word/2020/wordml/sdtdatahash" xmlns:w16sdtfl="http://schemas.microsoft.com/office/word/2024/wordml/sdtformatlock" xmlns:w16se="http://schemas.microsoft.com/office/word/2015/wordml/symex" xmlns:wpg="http://schemas.microsoft.com/office/word/2010/wordprocessingGroup" xmlns:wpi="http://schemas.microsoft.com/office/word/2010/wordprocessingInk" xmlns:wne="http://schemas.microsoft.com/office/word/2006/wordml" xmlns:wps="http://schemas.microsoft.com/office/word/2010/wordprocessingShape" mc:Ignorable="w14 w15 w16se w16cid w16 w16cex w16sdtdh w16sdtfl w16du wp14">
+<w:document xmlns:wpc="http://schemas.microsoft.com/office/word/2010/wordprocessingCanvas" xmlns:cx="http://schemas.microsoft.com/office/drawing/2014/chartex" xmlns:mc="http://schemas.openxmlformats.org/markup-compatibility/2006" xmlns:o="urn:schemas-microsoft-com:office:office" xmlns:r="http://schemas.openxmlformats.org/officeDocument/2006/relationships" xmlns:m="http://schemas.openxmlformats.org/officeDocument/2006/math" xmlns:v="urn:schemas-microsoft-com:vml" xmlns:wp14="http://schemas.microsoft.com/office/word/2010/wordprocessingDrawing" xmlns:wp="http://schemas.openxmlformats.org/drawingml/2006/wordprocessingDrawing" xmlns:w10="urn:schemas-microsoft-com:office:word" xmlns:w="http://schemas.openxmlformats.org/wordprocessingml/2006/main" xmlns:w14="http://schemas.microsoft.com/office/word/2010/wordml" xmlns:w15="http://schemas.microsoft.com/office/word/2012/wordml" xmlns:w16se="http://schemas.microsoft.com/office/word/2015/wordml/symex" xmlns:wpg="http://schemas.microsoft.com/office/word/2010/wordprocessingGroup" xmlns:wpi="http://schemas.microsoft.com/office/word/2010/wordprocessingInk" xmlns:wne="http://schemas.microsoft.com/office/word/2006/wordml" xmlns:wps="http://schemas.microsoft.com/office/word/2010/wordprocessingShape" mc:Ignorable="w14 w15 w16se wp14">
   <w:body>
     <w:p>
       <w:pPr>
@@ -1024,6 +1024,444 @@
         </w:drawing>
       </w:r>
     </w:p>
+    <w:p>
+      <w:pPr>
+        <w:rPr>
+          <w:sz w:val="40"/>
+          <w:szCs w:val="40"/>
+        </w:rPr>
+      </w:pPr>
+      <w:r>
+        <w:rPr>
+          <w:sz w:val="40"/>
+          <w:szCs w:val="40"/>
+        </w:rPr>
+        <w:lastRenderedPageBreak/>
+        <w:t>+Dynamic Routes with URL Para</w:t>
+      </w:r>
+    </w:p>
+    <w:p>
+      <w:pPr>
+        <w:rPr>
+          <w:sz w:val="40"/>
+          <w:szCs w:val="40"/>
+        </w:rPr>
+      </w:pPr>
+      <w:r>
+        <w:rPr>
+          <w:sz w:val="40"/>
+          <w:szCs w:val="40"/>
+        </w:rPr>
+        <w:drawing>
+          <wp:inline distT="0" distB="0" distL="0" distR="0" wp14:anchorId="49834EFC" wp14:editId="332BCA52">
+            <wp:extent cx="3301612" cy="173289"/>
+            <wp:effectExtent l="0" t="0" r="0" b="0"/>
+            <wp:docPr id="5" name="Picture 5"/>
+            <wp:cNvGraphicFramePr>
+              <a:graphicFrameLocks xmlns:a="http://schemas.openxmlformats.org/drawingml/2006/main" noChangeAspect="1"/>
+            </wp:cNvGraphicFramePr>
+            <a:graphic xmlns:a="http://schemas.openxmlformats.org/drawingml/2006/main">
+              <a:graphicData uri="http://schemas.openxmlformats.org/drawingml/2006/picture">
+                <pic:pic xmlns:pic="http://schemas.openxmlformats.org/drawingml/2006/picture">
+                  <pic:nvPicPr>
+                    <pic:cNvPr id="1" name=""/>
+                    <pic:cNvPicPr/>
+                  </pic:nvPicPr>
+                  <pic:blipFill>
+                    <a:blip r:embed="rId15"/>
+                    <a:stretch>
+                      <a:fillRect/>
+                    </a:stretch>
+                  </pic:blipFill>
+                  <pic:spPr>
+                    <a:xfrm>
+                      <a:off x="0" y="0"/>
+                      <a:ext cx="3673579" cy="192812"/>
+                    </a:xfrm>
+                    <a:prstGeom prst="rect">
+                      <a:avLst/>
+                    </a:prstGeom>
+                  </pic:spPr>
+                </pic:pic>
+              </a:graphicData>
+            </a:graphic>
+          </wp:inline>
+        </w:drawing>
+      </w:r>
+    </w:p>
+    <w:p>
+      <w:pPr>
+        <w:rPr>
+          <w:sz w:val="40"/>
+          <w:szCs w:val="40"/>
+        </w:rPr>
+      </w:pPr>
+      <w:r>
+        <w:rPr>
+          <w:sz w:val="40"/>
+          <w:szCs w:val="40"/>
+        </w:rPr>
+        <w:drawing>
+          <wp:inline distT="0" distB="0" distL="0" distR="0" wp14:anchorId="08572893" wp14:editId="6105C2EE">
+            <wp:extent cx="1786919" cy="424291"/>
+            <wp:effectExtent l="0" t="0" r="3810" b="0"/>
+            <wp:docPr id="6" name="Picture 6"/>
+            <wp:cNvGraphicFramePr>
+              <a:graphicFrameLocks xmlns:a="http://schemas.openxmlformats.org/drawingml/2006/main" noChangeAspect="1"/>
+            </wp:cNvGraphicFramePr>
+            <a:graphic xmlns:a="http://schemas.openxmlformats.org/drawingml/2006/main">
+              <a:graphicData uri="http://schemas.openxmlformats.org/drawingml/2006/picture">
+                <pic:pic xmlns:pic="http://schemas.openxmlformats.org/drawingml/2006/picture">
+                  <pic:nvPicPr>
+                    <pic:cNvPr id="1" name=""/>
+                    <pic:cNvPicPr/>
+                  </pic:nvPicPr>
+                  <pic:blipFill>
+                    <a:blip r:embed="rId16"/>
+                    <a:stretch>
+                      <a:fillRect/>
+                    </a:stretch>
+                  </pic:blipFill>
+                  <pic:spPr>
+                    <a:xfrm>
+                      <a:off x="0" y="0"/>
+                      <a:ext cx="1829505" cy="434403"/>
+                    </a:xfrm>
+                    <a:prstGeom prst="rect">
+                      <a:avLst/>
+                    </a:prstGeom>
+                  </pic:spPr>
+                </pic:pic>
+              </a:graphicData>
+            </a:graphic>
+          </wp:inline>
+        </w:drawing>
+      </w:r>
+    </w:p>
+    <w:p>
+      <w:pPr>
+        <w:rPr>
+          <w:sz w:val="40"/>
+          <w:szCs w:val="40"/>
+        </w:rPr>
+      </w:pPr>
+      <w:r>
+        <w:rPr>
+          <w:sz w:val="40"/>
+          <w:szCs w:val="40"/>
+        </w:rPr>
+        <w:t>+Read and set Query String</w:t>
+      </w:r>
+    </w:p>
+    <w:p>
+      <w:pPr>
+        <w:rPr>
+          <w:sz w:val="40"/>
+          <w:szCs w:val="40"/>
+        </w:rPr>
+      </w:pPr>
+      <w:r>
+        <w:rPr>
+          <w:sz w:val="40"/>
+          <w:szCs w:val="40"/>
+        </w:rPr>
+        <w:drawing>
+          <wp:inline distT="0" distB="0" distL="0" distR="0" wp14:anchorId="1F371BD9" wp14:editId="4604D90D">
+            <wp:extent cx="3483096" cy="605395"/>
+            <wp:effectExtent l="0" t="0" r="3175" b="4445"/>
+            <wp:docPr id="8" name="Picture 8"/>
+            <wp:cNvGraphicFramePr>
+              <a:graphicFrameLocks xmlns:a="http://schemas.openxmlformats.org/drawingml/2006/main" noChangeAspect="1"/>
+            </wp:cNvGraphicFramePr>
+            <a:graphic xmlns:a="http://schemas.openxmlformats.org/drawingml/2006/main">
+              <a:graphicData uri="http://schemas.openxmlformats.org/drawingml/2006/picture">
+                <pic:pic xmlns:pic="http://schemas.openxmlformats.org/drawingml/2006/picture">
+                  <pic:nvPicPr>
+                    <pic:cNvPr id="1" name=""/>
+                    <pic:cNvPicPr/>
+                  </pic:nvPicPr>
+                  <pic:blipFill>
+                    <a:blip r:embed="rId17"/>
+                    <a:stretch>
+                      <a:fillRect/>
+                    </a:stretch>
+                  </pic:blipFill>
+                  <pic:spPr>
+                    <a:xfrm>
+                      <a:off x="0" y="0"/>
+                      <a:ext cx="3589087" cy="623817"/>
+                    </a:xfrm>
+                    <a:prstGeom prst="rect">
+                      <a:avLst/>
+                    </a:prstGeom>
+                  </pic:spPr>
+                </pic:pic>
+              </a:graphicData>
+            </a:graphic>
+          </wp:inline>
+        </w:drawing>
+      </w:r>
+    </w:p>
+    <w:p>
+      <w:pPr>
+        <w:rPr>
+          <w:sz w:val="40"/>
+          <w:szCs w:val="40"/>
+        </w:rPr>
+      </w:pPr>
+      <w:r>
+        <w:rPr>
+          <w:sz w:val="40"/>
+          <w:szCs w:val="40"/>
+        </w:rPr>
+        <w:drawing>
+          <wp:inline distT="0" distB="0" distL="0" distR="0" wp14:anchorId="05835ABE" wp14:editId="3AFCAA11">
+            <wp:extent cx="4299774" cy="880342"/>
+            <wp:effectExtent l="0" t="0" r="5715" b="0"/>
+            <wp:docPr id="9" name="Picture 9"/>
+            <wp:cNvGraphicFramePr>
+              <a:graphicFrameLocks xmlns:a="http://schemas.openxmlformats.org/drawingml/2006/main" noChangeAspect="1"/>
+            </wp:cNvGraphicFramePr>
+            <a:graphic xmlns:a="http://schemas.openxmlformats.org/drawingml/2006/main">
+              <a:graphicData uri="http://schemas.openxmlformats.org/drawingml/2006/picture">
+                <pic:pic xmlns:pic="http://schemas.openxmlformats.org/drawingml/2006/picture">
+                  <pic:nvPicPr>
+                    <pic:cNvPr id="1" name=""/>
+                    <pic:cNvPicPr/>
+                  </pic:nvPicPr>
+                  <pic:blipFill>
+                    <a:blip r:embed="rId18"/>
+                    <a:stretch>
+                      <a:fillRect/>
+                    </a:stretch>
+                  </pic:blipFill>
+                  <pic:spPr>
+                    <a:xfrm>
+                      <a:off x="0" y="0"/>
+                      <a:ext cx="4325130" cy="885533"/>
+                    </a:xfrm>
+                    <a:prstGeom prst="rect">
+                      <a:avLst/>
+                    </a:prstGeom>
+                  </pic:spPr>
+                </pic:pic>
+              </a:graphicData>
+            </a:graphic>
+          </wp:inline>
+        </w:drawing>
+      </w:r>
+    </w:p>
+    <w:p>
+      <w:pPr>
+        <w:rPr>
+          <w:sz w:val="40"/>
+          <w:szCs w:val="40"/>
+        </w:rPr>
+      </w:pPr>
+      <w:r>
+        <w:rPr>
+          <w:sz w:val="40"/>
+          <w:szCs w:val="40"/>
+        </w:rPr>
+        <w:t>+</w:t>
+      </w:r>
+      <w:r>
+        <w:rPr>
+          <w:sz w:val="40"/>
+          <w:szCs w:val="40"/>
+        </w:rPr>
+        <w:t>Programmatic Navigation</w:t>
+      </w:r>
+    </w:p>
+    <w:p>
+      <w:pPr>
+        <w:rPr>
+          <w:sz w:val="40"/>
+          <w:szCs w:val="40"/>
+        </w:rPr>
+      </w:pPr>
+      <w:r>
+        <w:rPr>
+          <w:sz w:val="40"/>
+          <w:szCs w:val="40"/>
+        </w:rPr>
+        <w:t xml:space="preserve"> </w:t>
+      </w:r>
+      <w:r>
+        <w:rPr>
+          <w:b/>
+          <w:sz w:val="40"/>
+          <w:szCs w:val="40"/>
+        </w:rPr>
+        <w:t>useNavigate()</w:t>
+      </w:r>
+    </w:p>
+    <w:p>
+      <w:pPr>
+        <w:rPr>
+          <w:sz w:val="40"/>
+          <w:szCs w:val="40"/>
+        </w:rPr>
+      </w:pPr>
+      <w:r>
+        <w:rPr>
+          <w:sz w:val="40"/>
+          <w:szCs w:val="40"/>
+        </w:rPr>
+        <w:drawing>
+          <wp:inline distT="0" distB="0" distL="0" distR="0" wp14:anchorId="4ED8EAE4" wp14:editId="72B81A25">
+            <wp:extent cx="2429214" cy="419158"/>
+            <wp:effectExtent l="0" t="0" r="9525" b="0"/>
+            <wp:docPr id="10" name="Picture 10"/>
+            <wp:cNvGraphicFramePr>
+              <a:graphicFrameLocks xmlns:a="http://schemas.openxmlformats.org/drawingml/2006/main" noChangeAspect="1"/>
+            </wp:cNvGraphicFramePr>
+            <a:graphic xmlns:a="http://schemas.openxmlformats.org/drawingml/2006/main">
+              <a:graphicData uri="http://schemas.openxmlformats.org/drawingml/2006/picture">
+                <pic:pic xmlns:pic="http://schemas.openxmlformats.org/drawingml/2006/picture">
+                  <pic:nvPicPr>
+                    <pic:cNvPr id="1" name=""/>
+                    <pic:cNvPicPr/>
+                  </pic:nvPicPr>
+                  <pic:blipFill>
+                    <a:blip r:embed="rId19"/>
+                    <a:stretch>
+                      <a:fillRect/>
+                    </a:stretch>
+                  </pic:blipFill>
+                  <pic:spPr>
+                    <a:xfrm>
+                      <a:off x="0" y="0"/>
+                      <a:ext cx="2429214" cy="419158"/>
+                    </a:xfrm>
+                    <a:prstGeom prst="rect">
+                      <a:avLst/>
+                    </a:prstGeom>
+                  </pic:spPr>
+                </pic:pic>
+              </a:graphicData>
+            </a:graphic>
+          </wp:inline>
+        </w:drawing>
+      </w:r>
+    </w:p>
+    <w:p>
+      <w:pPr>
+        <w:rPr>
+          <w:sz w:val="40"/>
+          <w:szCs w:val="40"/>
+        </w:rPr>
+      </w:pPr>
+      <w:r>
+        <w:rPr>
+          <w:sz w:val="40"/>
+          <w:szCs w:val="40"/>
+        </w:rPr>
+        <w:drawing>
+          <wp:inline distT="0" distB="0" distL="0" distR="0" wp14:anchorId="5C70658E" wp14:editId="7CE3BB17">
+            <wp:extent cx="2792061" cy="2018585"/>
+            <wp:effectExtent l="0" t="0" r="8890" b="1270"/>
+            <wp:docPr id="11" name="Picture 11"/>
+            <wp:cNvGraphicFramePr>
+              <a:graphicFrameLocks xmlns:a="http://schemas.openxmlformats.org/drawingml/2006/main" noChangeAspect="1"/>
+            </wp:cNvGraphicFramePr>
+            <a:graphic xmlns:a="http://schemas.openxmlformats.org/drawingml/2006/main">
+              <a:graphicData uri="http://schemas.openxmlformats.org/drawingml/2006/picture">
+                <pic:pic xmlns:pic="http://schemas.openxmlformats.org/drawingml/2006/picture">
+                  <pic:nvPicPr>
+                    <pic:cNvPr id="1" name=""/>
+                    <pic:cNvPicPr/>
+                  </pic:nvPicPr>
+                  <pic:blipFill>
+                    <a:blip r:embed="rId20"/>
+                    <a:stretch>
+                      <a:fillRect/>
+                    </a:stretch>
+                  </pic:blipFill>
+                  <pic:spPr>
+                    <a:xfrm>
+                      <a:off x="0" y="0"/>
+                      <a:ext cx="2795281" cy="2020913"/>
+                    </a:xfrm>
+                    <a:prstGeom prst="rect">
+                      <a:avLst/>
+                    </a:prstGeom>
+                  </pic:spPr>
+                </pic:pic>
+              </a:graphicData>
+            </a:graphic>
+          </wp:inline>
+        </w:drawing>
+      </w:r>
+    </w:p>
+    <w:p>
+      <w:pPr>
+        <w:rPr>
+          <w:b/>
+          <w:sz w:val="40"/>
+          <w:szCs w:val="40"/>
+        </w:rPr>
+      </w:pPr>
+      <w:r>
+        <w:rPr>
+          <w:b/>
+          <w:sz w:val="40"/>
+          <w:szCs w:val="40"/>
+        </w:rPr>
+        <w:t>&lt;Navigate /&gt;</w:t>
+      </w:r>
+    </w:p>
+    <w:p>
+      <w:pPr>
+        <w:rPr>
+          <w:sz w:val="40"/>
+          <w:szCs w:val="40"/>
+        </w:rPr>
+      </w:pPr>
+      <w:bookmarkStart w:id="0" w:name="_GoBack"/>
+      <w:r>
+        <w:rPr>
+          <w:sz w:val="40"/>
+          <w:szCs w:val="40"/>
+        </w:rPr>
+        <w:drawing>
+          <wp:inline distT="0" distB="0" distL="0" distR="0" wp14:anchorId="7CE7B633" wp14:editId="6045AF79">
+            <wp:extent cx="4486901" cy="333422"/>
+            <wp:effectExtent l="0" t="0" r="0" b="9525"/>
+            <wp:docPr id="12" name="Picture 12"/>
+            <wp:cNvGraphicFramePr>
+              <a:graphicFrameLocks xmlns:a="http://schemas.openxmlformats.org/drawingml/2006/main" noChangeAspect="1"/>
+            </wp:cNvGraphicFramePr>
+            <a:graphic xmlns:a="http://schemas.openxmlformats.org/drawingml/2006/main">
+              <a:graphicData uri="http://schemas.openxmlformats.org/drawingml/2006/picture">
+                <pic:pic xmlns:pic="http://schemas.openxmlformats.org/drawingml/2006/picture">
+                  <pic:nvPicPr>
+                    <pic:cNvPr id="1" name=""/>
+                    <pic:cNvPicPr/>
+                  </pic:nvPicPr>
+                  <pic:blipFill>
+                    <a:blip r:embed="rId21"/>
+                    <a:stretch>
+                      <a:fillRect/>
+                    </a:stretch>
+                  </pic:blipFill>
+                  <pic:spPr>
+                    <a:xfrm>
+                      <a:off x="0" y="0"/>
+                      <a:ext cx="4486901" cy="333422"/>
+                    </a:xfrm>
+                    <a:prstGeom prst="rect">
+                      <a:avLst/>
+                    </a:prstGeom>
+                  </pic:spPr>
+                </pic:pic>
+              </a:graphicData>
+            </a:graphic>
+          </wp:inline>
+        </w:drawing>
+      </w:r>
+      <w:bookmarkEnd w:id="0"/>
+    </w:p>
     <w:sectPr>
       <w:pgSz w:w="12240" w:h="15840"/>
       <w:pgMar w:top="1440" w:right="1440" w:bottom="1440" w:left="1440" w:header="720" w:footer="720" w:gutter="0"/>
@@ -1035,7 +1473,7 @@
 </file>
 
 <file path=word/styles.xml><?xml version="1.0" encoding="utf-8"?>
-<w:styles xmlns:mc="http://schemas.openxmlformats.org/markup-compatibility/2006" xmlns:r="http://schemas.openxmlformats.org/officeDocument/2006/relationships" xmlns:w="http://schemas.openxmlformats.org/wordprocessingml/2006/main" xmlns:w14="http://schemas.microsoft.com/office/word/2010/wordml" xmlns:w15="http://schemas.microsoft.com/office/word/2012/wordml" xmlns:w16cex="http://schemas.microsoft.com/office/word/2018/wordml/cex" xmlns:w16cid="http://schemas.microsoft.com/office/word/2016/wordml/cid" xmlns:w16="http://schemas.microsoft.com/office/word/2018/wordml" xmlns:w16du="http://schemas.microsoft.com/office/word/2023/wordml/word16du" xmlns:w16sdtdh="http://schemas.microsoft.com/office/word/2020/wordml/sdtdatahash" xmlns:w16sdtfl="http://schemas.microsoft.com/office/word/2024/wordml/sdtformatlock" xmlns:w16se="http://schemas.microsoft.com/office/word/2015/wordml/symex" mc:Ignorable="w14 w15 w16se w16cid w16 w16cex w16sdtdh w16sdtfl w16du">
+<w:styles xmlns:mc="http://schemas.openxmlformats.org/markup-compatibility/2006" xmlns:r="http://schemas.openxmlformats.org/officeDocument/2006/relationships" xmlns:w="http://schemas.openxmlformats.org/wordprocessingml/2006/main" xmlns:w14="http://schemas.microsoft.com/office/word/2010/wordml" xmlns:w15="http://schemas.microsoft.com/office/word/2012/wordml" xmlns:w16se="http://schemas.microsoft.com/office/word/2015/wordml/symex" mc:Ignorable="w14 w15 w16se">
   <w:docDefaults>
     <w:rPrDefault>
       <w:rPr>
@@ -1051,7 +1489,7 @@
       </w:pPr>
     </w:pPrDefault>
   </w:docDefaults>
-  <w:latentStyles w:defLockedState="0" w:defUIPriority="99" w:defSemiHidden="0" w:defUnhideWhenUsed="0" w:defQFormat="0" w:count="376">
+  <w:latentStyles w:defLockedState="0" w:defUIPriority="99" w:defSemiHidden="0" w:defUnhideWhenUsed="0" w:defQFormat="0" w:count="371">
     <w:lsdException w:name="Normal" w:uiPriority="0" w:qFormat="1"/>
     <w:lsdException w:name="heading 1" w:uiPriority="9" w:qFormat="1"/>
     <w:lsdException w:name="heading 2" w:semiHidden="1" w:uiPriority="9" w:unhideWhenUsed="1" w:qFormat="1"/>
@@ -1423,11 +1861,6 @@
     <w:lsdException w:name="List Table 5 Dark Accent 6" w:uiPriority="50"/>
     <w:lsdException w:name="List Table 6 Colorful Accent 6" w:uiPriority="51"/>
     <w:lsdException w:name="List Table 7 Colorful Accent 6" w:uiPriority="52"/>
-    <w:lsdException w:name="Mention" w:semiHidden="1" w:unhideWhenUsed="1"/>
-    <w:lsdException w:name="Smart Hyperlink" w:semiHidden="1" w:unhideWhenUsed="1"/>
-    <w:lsdException w:name="Hashtag" w:semiHidden="1" w:unhideWhenUsed="1"/>
-    <w:lsdException w:name="Unresolved Mention" w:semiHidden="1" w:unhideWhenUsed="1"/>
-    <w:lsdException w:name="Smart Link" w:semiHidden="1" w:unhideWhenUsed="1"/>
   </w:latentStyles>
   <w:style w:type="paragraph" w:default="1" w:styleId="Normal">
     <w:name w:val="Normal"/>

</xml_diff>

<commit_message>
Ultimate Reactt Course: Update section 18
</commit_message>
<xml_diff>
--- a/3.React/UltimateReactCourse/Document/3.docx
+++ b/3.React/UltimateReactCourse/Document/3.docx
@@ -14,7 +14,32 @@
           <w:sz w:val="40"/>
           <w:szCs w:val="40"/>
         </w:rPr>
-        <w:t xml:space="preserve">-useRedudcer(): </w:t>
+        <w:t>-</w:t>
+      </w:r>
+      <w:proofErr w:type="spellStart"/>
+      <w:proofErr w:type="gramStart"/>
+      <w:r>
+        <w:rPr>
+          <w:sz w:val="40"/>
+          <w:szCs w:val="40"/>
+        </w:rPr>
+        <w:t>useRedudcer</w:t>
+      </w:r>
+      <w:proofErr w:type="spellEnd"/>
+      <w:r>
+        <w:rPr>
+          <w:sz w:val="40"/>
+          <w:szCs w:val="40"/>
+        </w:rPr>
+        <w:t>(</w:t>
+      </w:r>
+      <w:proofErr w:type="gramEnd"/>
+      <w:r>
+        <w:rPr>
+          <w:sz w:val="40"/>
+          <w:szCs w:val="40"/>
+        </w:rPr>
+        <w:t xml:space="preserve">): </w:t>
       </w:r>
     </w:p>
     <w:p>
@@ -257,8 +282,17 @@
           <w:sz w:val="40"/>
           <w:szCs w:val="40"/>
         </w:rPr>
-        <w:t>+Fake data questions: data/questions.json</w:t>
-      </w:r>
+        <w:t>+Fake data questions: data/</w:t>
+      </w:r>
+      <w:proofErr w:type="spellStart"/>
+      <w:r>
+        <w:rPr>
+          <w:sz w:val="40"/>
+          <w:szCs w:val="40"/>
+        </w:rPr>
+        <w:t>questions.json</w:t>
+      </w:r>
+      <w:proofErr w:type="spellEnd"/>
     </w:p>
     <w:p>
       <w:pPr>
@@ -271,7 +305,23 @@
           <w:sz w:val="40"/>
           <w:szCs w:val="40"/>
         </w:rPr>
-        <w:t>+Install json-server:</w:t>
+        <w:t xml:space="preserve">+Install </w:t>
+      </w:r>
+      <w:proofErr w:type="spellStart"/>
+      <w:r>
+        <w:rPr>
+          <w:sz w:val="40"/>
+          <w:szCs w:val="40"/>
+        </w:rPr>
+        <w:t>json</w:t>
+      </w:r>
+      <w:proofErr w:type="spellEnd"/>
+      <w:r>
+        <w:rPr>
+          <w:sz w:val="40"/>
+          <w:szCs w:val="40"/>
+        </w:rPr>
+        <w:t>-server:</w:t>
       </w:r>
       <w:r>
         <w:rPr>
@@ -388,7 +438,23 @@
           <w:sz w:val="40"/>
           <w:szCs w:val="40"/>
         </w:rPr>
-        <w:t>And: npm run server</w:t>
+        <w:t xml:space="preserve">And: </w:t>
+      </w:r>
+      <w:proofErr w:type="spellStart"/>
+      <w:r>
+        <w:rPr>
+          <w:sz w:val="40"/>
+          <w:szCs w:val="40"/>
+        </w:rPr>
+        <w:t>npm</w:t>
+      </w:r>
+      <w:proofErr w:type="spellEnd"/>
+      <w:r>
+        <w:rPr>
+          <w:sz w:val="40"/>
+          <w:szCs w:val="40"/>
+        </w:rPr>
+        <w:t xml:space="preserve"> run server</w:t>
       </w:r>
     </w:p>
     <w:tbl>
@@ -740,6 +806,7 @@
         </w:rPr>
         <w:t>+</w:t>
       </w:r>
+      <w:proofErr w:type="spellStart"/>
       <w:r>
         <w:rPr>
           <w:b/>
@@ -749,6 +816,7 @@
         </w:rPr>
         <w:t>BrowserRouter</w:t>
       </w:r>
+      <w:proofErr w:type="spellEnd"/>
     </w:p>
     <w:p>
       <w:pPr>
@@ -826,7 +894,23 @@
           <w:sz w:val="40"/>
           <w:szCs w:val="40"/>
         </w:rPr>
-        <w:t>+Use &lt;Link&gt; or &lt;NavLink&gt;</w:t>
+        <w:t>+Use &lt;Link&gt; or &lt;</w:t>
+      </w:r>
+      <w:proofErr w:type="spellStart"/>
+      <w:r>
+        <w:rPr>
+          <w:sz w:val="40"/>
+          <w:szCs w:val="40"/>
+        </w:rPr>
+        <w:t>NavLink</w:t>
+      </w:r>
+      <w:proofErr w:type="spellEnd"/>
+      <w:r>
+        <w:rPr>
+          <w:sz w:val="40"/>
+          <w:szCs w:val="40"/>
+        </w:rPr>
+        <w:t>&gt;</w:t>
       </w:r>
     </w:p>
     <w:p>
@@ -933,7 +1017,23 @@
           <w:sz w:val="40"/>
           <w:szCs w:val="40"/>
         </w:rPr>
-        <w:t>+Nested Routes and Inex Route</w:t>
+        <w:t xml:space="preserve">+Nested Routes and </w:t>
+      </w:r>
+      <w:proofErr w:type="spellStart"/>
+      <w:r>
+        <w:rPr>
+          <w:sz w:val="40"/>
+          <w:szCs w:val="40"/>
+        </w:rPr>
+        <w:t>Inex</w:t>
+      </w:r>
+      <w:proofErr w:type="spellEnd"/>
+      <w:r>
+        <w:rPr>
+          <w:sz w:val="40"/>
+          <w:szCs w:val="40"/>
+        </w:rPr>
+        <w:t xml:space="preserve"> Route</w:t>
       </w:r>
     </w:p>
     <w:p>
@@ -1049,6 +1149,7 @@
       </w:pPr>
       <w:r>
         <w:rPr>
+          <w:noProof/>
           <w:sz w:val="40"/>
           <w:szCs w:val="40"/>
         </w:rPr>
@@ -1098,6 +1199,7 @@
       </w:pPr>
       <w:r>
         <w:rPr>
+          <w:noProof/>
           <w:sz w:val="40"/>
           <w:szCs w:val="40"/>
         </w:rPr>
@@ -1162,6 +1264,7 @@
       </w:pPr>
       <w:r>
         <w:rPr>
+          <w:noProof/>
           <w:sz w:val="40"/>
           <w:szCs w:val="40"/>
         </w:rPr>
@@ -1211,6 +1314,7 @@
       </w:pPr>
       <w:r>
         <w:rPr>
+          <w:noProof/>
           <w:sz w:val="40"/>
           <w:szCs w:val="40"/>
         </w:rPr>
@@ -1287,24 +1391,45 @@
         </w:rPr>
         <w:t xml:space="preserve"> </w:t>
       </w:r>
+      <w:proofErr w:type="spellStart"/>
+      <w:proofErr w:type="gramStart"/>
       <w:r>
         <w:rPr>
           <w:b/>
           <w:sz w:val="40"/>
           <w:szCs w:val="40"/>
         </w:rPr>
-        <w:t>useNavigate()</w:t>
-      </w:r>
-    </w:p>
-    <w:p>
-      <w:pPr>
-        <w:rPr>
-          <w:sz w:val="40"/>
-          <w:szCs w:val="40"/>
-        </w:rPr>
-      </w:pPr>
-      <w:r>
-        <w:rPr>
+        <w:t>useNavigate</w:t>
+      </w:r>
+      <w:proofErr w:type="spellEnd"/>
+      <w:r>
+        <w:rPr>
+          <w:b/>
+          <w:sz w:val="40"/>
+          <w:szCs w:val="40"/>
+        </w:rPr>
+        <w:t>(</w:t>
+      </w:r>
+      <w:proofErr w:type="gramEnd"/>
+      <w:r>
+        <w:rPr>
+          <w:b/>
+          <w:sz w:val="40"/>
+          <w:szCs w:val="40"/>
+        </w:rPr>
+        <w:t>)</w:t>
+      </w:r>
+    </w:p>
+    <w:p>
+      <w:pPr>
+        <w:rPr>
+          <w:sz w:val="40"/>
+          <w:szCs w:val="40"/>
+        </w:rPr>
+      </w:pPr>
+      <w:r>
+        <w:rPr>
+          <w:noProof/>
           <w:sz w:val="40"/>
           <w:szCs w:val="40"/>
         </w:rPr>
@@ -1354,6 +1479,7 @@
       </w:pPr>
       <w:r>
         <w:rPr>
+          <w:noProof/>
           <w:sz w:val="40"/>
           <w:szCs w:val="40"/>
         </w:rPr>
@@ -1418,9 +1544,9 @@
           <w:szCs w:val="40"/>
         </w:rPr>
       </w:pPr>
-      <w:bookmarkStart w:id="0" w:name="_GoBack"/>
-      <w:r>
-        <w:rPr>
+      <w:r>
+        <w:rPr>
+          <w:noProof/>
           <w:sz w:val="40"/>
           <w:szCs w:val="40"/>
         </w:rPr>
@@ -1460,6 +1586,136 @@
           </wp:inline>
         </w:drawing>
       </w:r>
+    </w:p>
+    <w:p>
+      <w:pPr>
+        <w:rPr>
+          <w:sz w:val="40"/>
+          <w:szCs w:val="40"/>
+        </w:rPr>
+      </w:pPr>
+      <w:r>
+        <w:rPr>
+          <w:sz w:val="40"/>
+          <w:szCs w:val="40"/>
+        </w:rPr>
+        <w:lastRenderedPageBreak/>
+        <w:t>-Context API:</w:t>
+      </w:r>
+    </w:p>
+    <w:p>
+      <w:pPr>
+        <w:rPr>
+          <w:sz w:val="40"/>
+          <w:szCs w:val="40"/>
+        </w:rPr>
+      </w:pPr>
+      <w:r>
+        <w:rPr>
+          <w:sz w:val="40"/>
+          <w:szCs w:val="40"/>
+        </w:rPr>
+        <w:t>+Create and Provide a Context</w:t>
+      </w:r>
+    </w:p>
+    <w:p>
+      <w:pPr>
+        <w:rPr>
+          <w:sz w:val="40"/>
+          <w:szCs w:val="40"/>
+        </w:rPr>
+      </w:pPr>
+      <w:r>
+        <w:rPr>
+          <w:sz w:val="40"/>
+          <w:szCs w:val="40"/>
+        </w:rPr>
+        <w:drawing>
+          <wp:inline distT="0" distB="0" distL="0" distR="0" wp14:anchorId="07A46900" wp14:editId="2D519F45">
+            <wp:extent cx="2233649" cy="502571"/>
+            <wp:effectExtent l="0" t="0" r="0" b="0"/>
+            <wp:docPr id="13" name="Picture 13"/>
+            <wp:cNvGraphicFramePr>
+              <a:graphicFrameLocks xmlns:a="http://schemas.openxmlformats.org/drawingml/2006/main" noChangeAspect="1"/>
+            </wp:cNvGraphicFramePr>
+            <a:graphic xmlns:a="http://schemas.openxmlformats.org/drawingml/2006/main">
+              <a:graphicData uri="http://schemas.openxmlformats.org/drawingml/2006/picture">
+                <pic:pic xmlns:pic="http://schemas.openxmlformats.org/drawingml/2006/picture">
+                  <pic:nvPicPr>
+                    <pic:cNvPr id="1" name=""/>
+                    <pic:cNvPicPr/>
+                  </pic:nvPicPr>
+                  <pic:blipFill>
+                    <a:blip r:embed="rId22"/>
+                    <a:stretch>
+                      <a:fillRect/>
+                    </a:stretch>
+                  </pic:blipFill>
+                  <pic:spPr>
+                    <a:xfrm>
+                      <a:off x="0" y="0"/>
+                      <a:ext cx="2341417" cy="526819"/>
+                    </a:xfrm>
+                    <a:prstGeom prst="rect">
+                      <a:avLst/>
+                    </a:prstGeom>
+                  </pic:spPr>
+                </pic:pic>
+              </a:graphicData>
+            </a:graphic>
+          </wp:inline>
+        </w:drawing>
+      </w:r>
+    </w:p>
+    <w:p>
+      <w:pPr>
+        <w:rPr>
+          <w:sz w:val="40"/>
+          <w:szCs w:val="40"/>
+        </w:rPr>
+      </w:pPr>
+      <w:r>
+        <w:rPr>
+          <w:sz w:val="40"/>
+          <w:szCs w:val="40"/>
+        </w:rPr>
+        <w:drawing>
+          <wp:inline distT="0" distB="0" distL="0" distR="0" wp14:anchorId="4E7DE987" wp14:editId="614CF162">
+            <wp:extent cx="2675702" cy="1717117"/>
+            <wp:effectExtent l="0" t="0" r="0" b="0"/>
+            <wp:docPr id="14" name="Picture 14"/>
+            <wp:cNvGraphicFramePr>
+              <a:graphicFrameLocks xmlns:a="http://schemas.openxmlformats.org/drawingml/2006/main" noChangeAspect="1"/>
+            </wp:cNvGraphicFramePr>
+            <a:graphic xmlns:a="http://schemas.openxmlformats.org/drawingml/2006/main">
+              <a:graphicData uri="http://schemas.openxmlformats.org/drawingml/2006/picture">
+                <pic:pic xmlns:pic="http://schemas.openxmlformats.org/drawingml/2006/picture">
+                  <pic:nvPicPr>
+                    <pic:cNvPr id="1" name=""/>
+                    <pic:cNvPicPr/>
+                  </pic:nvPicPr>
+                  <pic:blipFill>
+                    <a:blip r:embed="rId23"/>
+                    <a:stretch>
+                      <a:fillRect/>
+                    </a:stretch>
+                  </pic:blipFill>
+                  <pic:spPr>
+                    <a:xfrm>
+                      <a:off x="0" y="0"/>
+                      <a:ext cx="2686443" cy="1724010"/>
+                    </a:xfrm>
+                    <a:prstGeom prst="rect">
+                      <a:avLst/>
+                    </a:prstGeom>
+                  </pic:spPr>
+                </pic:pic>
+              </a:graphicData>
+            </a:graphic>
+          </wp:inline>
+        </w:drawing>
+      </w:r>
+      <w:bookmarkStart w:id="0" w:name="_GoBack"/>
       <w:bookmarkEnd w:id="0"/>
     </w:p>
     <w:sectPr>

</xml_diff>

<commit_message>
Ultimate React Course: complete section 18
</commit_message>
<xml_diff>
--- a/3.React/UltimateReactCourse/Document/3.docx
+++ b/3.React/UltimateReactCourse/Document/3.docx
@@ -2344,6 +2344,539 @@
           <w:szCs w:val="40"/>
         </w:rPr>
       </w:pPr>
+      <w:r>
+        <w:rPr>
+          <w:sz w:val="40"/>
+          <w:szCs w:val="40"/>
+        </w:rPr>
+        <w:t>-Advanced State Management System: Context + useReducer()</w:t>
+      </w:r>
+    </w:p>
+    <w:p>
+      <w:pPr>
+        <w:rPr>
+          <w:noProof/>
+        </w:rPr>
+      </w:pPr>
+    </w:p>
+    <w:p>
+      <w:pPr>
+        <w:rPr>
+          <w:sz w:val="40"/>
+          <w:szCs w:val="40"/>
+        </w:rPr>
+      </w:pPr>
+      <w:r>
+        <w:rPr>
+          <w:noProof/>
+        </w:rPr>
+        <w:lastRenderedPageBreak/>
+        <w:drawing>
+          <wp:inline distT="0" distB="0" distL="0" distR="0" wp14:anchorId="620AA745" wp14:editId="630F6844">
+            <wp:extent cx="3400114" cy="4527550"/>
+            <wp:effectExtent l="0" t="0" r="0" b="6350"/>
+            <wp:docPr id="887322715" name="Picture 1" descr="A screen shot of a computer program&#10;&#10;AI-generated content may be incorrect."/>
+            <wp:cNvGraphicFramePr>
+              <a:graphicFrameLocks xmlns:a="http://schemas.openxmlformats.org/drawingml/2006/main" noChangeAspect="1"/>
+            </wp:cNvGraphicFramePr>
+            <a:graphic xmlns:a="http://schemas.openxmlformats.org/drawingml/2006/main">
+              <a:graphicData uri="http://schemas.openxmlformats.org/drawingml/2006/picture">
+                <pic:pic xmlns:pic="http://schemas.openxmlformats.org/drawingml/2006/picture">
+                  <pic:nvPicPr>
+                    <pic:cNvPr id="887322715" name="Picture 1" descr="A screen shot of a computer program&#10;&#10;AI-generated content may be incorrect."/>
+                    <pic:cNvPicPr/>
+                  </pic:nvPicPr>
+                  <pic:blipFill>
+                    <a:blip r:embed="rId37"/>
+                    <a:stretch>
+                      <a:fillRect/>
+                    </a:stretch>
+                  </pic:blipFill>
+                  <pic:spPr>
+                    <a:xfrm>
+                      <a:off x="0" y="0"/>
+                      <a:ext cx="3415145" cy="4547566"/>
+                    </a:xfrm>
+                    <a:prstGeom prst="rect">
+                      <a:avLst/>
+                    </a:prstGeom>
+                  </pic:spPr>
+                </pic:pic>
+              </a:graphicData>
+            </a:graphic>
+          </wp:inline>
+        </w:drawing>
+      </w:r>
+    </w:p>
+    <w:p>
+      <w:pPr>
+        <w:rPr>
+          <w:sz w:val="40"/>
+          <w:szCs w:val="40"/>
+        </w:rPr>
+      </w:pPr>
+      <w:r>
+        <w:rPr>
+          <w:noProof/>
+        </w:rPr>
+        <w:lastRenderedPageBreak/>
+        <w:drawing>
+          <wp:inline distT="0" distB="0" distL="0" distR="0" wp14:anchorId="6955C00A" wp14:editId="25F3C231">
+            <wp:extent cx="3334470" cy="2419350"/>
+            <wp:effectExtent l="0" t="0" r="0" b="0"/>
+            <wp:docPr id="535398876" name="Picture 1" descr="A screen shot of a computer code&#10;&#10;AI-generated content may be incorrect."/>
+            <wp:cNvGraphicFramePr>
+              <a:graphicFrameLocks xmlns:a="http://schemas.openxmlformats.org/drawingml/2006/main" noChangeAspect="1"/>
+            </wp:cNvGraphicFramePr>
+            <a:graphic xmlns:a="http://schemas.openxmlformats.org/drawingml/2006/main">
+              <a:graphicData uri="http://schemas.openxmlformats.org/drawingml/2006/picture">
+                <pic:pic xmlns:pic="http://schemas.openxmlformats.org/drawingml/2006/picture">
+                  <pic:nvPicPr>
+                    <pic:cNvPr id="535398876" name="Picture 1" descr="A screen shot of a computer code&#10;&#10;AI-generated content may be incorrect."/>
+                    <pic:cNvPicPr/>
+                  </pic:nvPicPr>
+                  <pic:blipFill>
+                    <a:blip r:embed="rId38"/>
+                    <a:stretch>
+                      <a:fillRect/>
+                    </a:stretch>
+                  </pic:blipFill>
+                  <pic:spPr>
+                    <a:xfrm>
+                      <a:off x="0" y="0"/>
+                      <a:ext cx="3351762" cy="2431897"/>
+                    </a:xfrm>
+                    <a:prstGeom prst="rect">
+                      <a:avLst/>
+                    </a:prstGeom>
+                  </pic:spPr>
+                </pic:pic>
+              </a:graphicData>
+            </a:graphic>
+          </wp:inline>
+        </w:drawing>
+      </w:r>
+      <w:r>
+        <w:rPr>
+          <w:noProof/>
+        </w:rPr>
+        <w:drawing>
+          <wp:inline distT="0" distB="0" distL="0" distR="0" wp14:anchorId="632F1CA0" wp14:editId="34D0C8F9">
+            <wp:extent cx="3357379" cy="5187950"/>
+            <wp:effectExtent l="0" t="0" r="0" b="0"/>
+            <wp:docPr id="2065696606" name="Picture 1" descr="A screen shot of a computer program&#10;&#10;AI-generated content may be incorrect."/>
+            <wp:cNvGraphicFramePr>
+              <a:graphicFrameLocks xmlns:a="http://schemas.openxmlformats.org/drawingml/2006/main" noChangeAspect="1"/>
+            </wp:cNvGraphicFramePr>
+            <a:graphic xmlns:a="http://schemas.openxmlformats.org/drawingml/2006/main">
+              <a:graphicData uri="http://schemas.openxmlformats.org/drawingml/2006/picture">
+                <pic:pic xmlns:pic="http://schemas.openxmlformats.org/drawingml/2006/picture">
+                  <pic:nvPicPr>
+                    <pic:cNvPr id="2065696606" name="Picture 1" descr="A screen shot of a computer program&#10;&#10;AI-generated content may be incorrect."/>
+                    <pic:cNvPicPr/>
+                  </pic:nvPicPr>
+                  <pic:blipFill>
+                    <a:blip r:embed="rId39"/>
+                    <a:stretch>
+                      <a:fillRect/>
+                    </a:stretch>
+                  </pic:blipFill>
+                  <pic:spPr>
+                    <a:xfrm>
+                      <a:off x="0" y="0"/>
+                      <a:ext cx="3359615" cy="5191405"/>
+                    </a:xfrm>
+                    <a:prstGeom prst="rect">
+                      <a:avLst/>
+                    </a:prstGeom>
+                  </pic:spPr>
+                </pic:pic>
+              </a:graphicData>
+            </a:graphic>
+          </wp:inline>
+        </w:drawing>
+      </w:r>
+    </w:p>
+    <w:p>
+      <w:pPr>
+        <w:rPr>
+          <w:noProof/>
+        </w:rPr>
+      </w:pPr>
+    </w:p>
+    <w:p>
+      <w:pPr>
+        <w:rPr>
+          <w:sz w:val="40"/>
+          <w:szCs w:val="40"/>
+        </w:rPr>
+      </w:pPr>
+      <w:r>
+        <w:rPr>
+          <w:noProof/>
+        </w:rPr>
+        <w:lastRenderedPageBreak/>
+        <w:drawing>
+          <wp:inline distT="0" distB="0" distL="0" distR="0" wp14:anchorId="5A2E7C75" wp14:editId="76F2CFF3">
+            <wp:extent cx="3526017" cy="4978400"/>
+            <wp:effectExtent l="0" t="0" r="0" b="0"/>
+            <wp:docPr id="244386810" name="Picture 1" descr="A screen shot of a computer program&#10;&#10;AI-generated content may be incorrect."/>
+            <wp:cNvGraphicFramePr>
+              <a:graphicFrameLocks xmlns:a="http://schemas.openxmlformats.org/drawingml/2006/main" noChangeAspect="1"/>
+            </wp:cNvGraphicFramePr>
+            <a:graphic xmlns:a="http://schemas.openxmlformats.org/drawingml/2006/main">
+              <a:graphicData uri="http://schemas.openxmlformats.org/drawingml/2006/picture">
+                <pic:pic xmlns:pic="http://schemas.openxmlformats.org/drawingml/2006/picture">
+                  <pic:nvPicPr>
+                    <pic:cNvPr id="244386810" name="Picture 1" descr="A screen shot of a computer program&#10;&#10;AI-generated content may be incorrect."/>
+                    <pic:cNvPicPr/>
+                  </pic:nvPicPr>
+                  <pic:blipFill>
+                    <a:blip r:embed="rId40"/>
+                    <a:stretch>
+                      <a:fillRect/>
+                    </a:stretch>
+                  </pic:blipFill>
+                  <pic:spPr>
+                    <a:xfrm>
+                      <a:off x="0" y="0"/>
+                      <a:ext cx="3528110" cy="4981356"/>
+                    </a:xfrm>
+                    <a:prstGeom prst="rect">
+                      <a:avLst/>
+                    </a:prstGeom>
+                  </pic:spPr>
+                </pic:pic>
+              </a:graphicData>
+            </a:graphic>
+          </wp:inline>
+        </w:drawing>
+      </w:r>
+    </w:p>
+    <w:p>
+      <w:pPr>
+        <w:rPr>
+          <w:sz w:val="40"/>
+          <w:szCs w:val="40"/>
+        </w:rPr>
+      </w:pPr>
+      <w:r>
+        <w:rPr>
+          <w:noProof/>
+        </w:rPr>
+        <w:drawing>
+          <wp:inline distT="0" distB="0" distL="0" distR="0" wp14:anchorId="3FA6034B" wp14:editId="6A4D2185">
+            <wp:extent cx="4612943" cy="1067660"/>
+            <wp:effectExtent l="0" t="0" r="0" b="0"/>
+            <wp:docPr id="1172324015" name="Picture 1" descr="A screen shot of a computer code&#10;&#10;AI-generated content may be incorrect."/>
+            <wp:cNvGraphicFramePr>
+              <a:graphicFrameLocks xmlns:a="http://schemas.openxmlformats.org/drawingml/2006/main" noChangeAspect="1"/>
+            </wp:cNvGraphicFramePr>
+            <a:graphic xmlns:a="http://schemas.openxmlformats.org/drawingml/2006/main">
+              <a:graphicData uri="http://schemas.openxmlformats.org/drawingml/2006/picture">
+                <pic:pic xmlns:pic="http://schemas.openxmlformats.org/drawingml/2006/picture">
+                  <pic:nvPicPr>
+                    <pic:cNvPr id="1172324015" name="Picture 1" descr="A screen shot of a computer code&#10;&#10;AI-generated content may be incorrect."/>
+                    <pic:cNvPicPr/>
+                  </pic:nvPicPr>
+                  <pic:blipFill>
+                    <a:blip r:embed="rId41"/>
+                    <a:stretch>
+                      <a:fillRect/>
+                    </a:stretch>
+                  </pic:blipFill>
+                  <pic:spPr>
+                    <a:xfrm>
+                      <a:off x="0" y="0"/>
+                      <a:ext cx="4619221" cy="1069113"/>
+                    </a:xfrm>
+                    <a:prstGeom prst="rect">
+                      <a:avLst/>
+                    </a:prstGeom>
+                  </pic:spPr>
+                </pic:pic>
+              </a:graphicData>
+            </a:graphic>
+          </wp:inline>
+        </w:drawing>
+      </w:r>
+    </w:p>
+    <w:p>
+      <w:pPr>
+        <w:rPr>
+          <w:sz w:val="40"/>
+          <w:szCs w:val="40"/>
+        </w:rPr>
+      </w:pPr>
+      <w:r>
+        <w:rPr>
+          <w:sz w:val="40"/>
+          <w:szCs w:val="40"/>
+        </w:rPr>
+        <w:t>-Fake Authentication</w:t>
+      </w:r>
+    </w:p>
+    <w:p>
+      <w:pPr>
+        <w:rPr>
+          <w:sz w:val="40"/>
+          <w:szCs w:val="40"/>
+        </w:rPr>
+      </w:pPr>
+      <w:r>
+        <w:rPr>
+          <w:sz w:val="40"/>
+          <w:szCs w:val="40"/>
+        </w:rPr>
+        <w:t>+Set up Context</w:t>
+      </w:r>
+      <w:r>
+        <w:rPr>
+          <w:sz w:val="40"/>
+          <w:szCs w:val="40"/>
+        </w:rPr>
+        <w:t xml:space="preserve"> and Implement Login</w:t>
+      </w:r>
+    </w:p>
+    <w:p>
+      <w:pPr>
+        <w:rPr>
+          <w:sz w:val="40"/>
+          <w:szCs w:val="40"/>
+        </w:rPr>
+      </w:pPr>
+      <w:r>
+        <w:rPr>
+          <w:noProof/>
+        </w:rPr>
+        <w:lastRenderedPageBreak/>
+        <w:drawing>
+          <wp:inline distT="0" distB="0" distL="0" distR="0" wp14:anchorId="6D7986D9" wp14:editId="566EAFB8">
+            <wp:extent cx="3050275" cy="2446863"/>
+            <wp:effectExtent l="0" t="0" r="0" b="0"/>
+            <wp:docPr id="1160088160" name="Picture 1" descr="A screen shot of a computer program&#10;&#10;AI-generated content may be incorrect."/>
+            <wp:cNvGraphicFramePr>
+              <a:graphicFrameLocks xmlns:a="http://schemas.openxmlformats.org/drawingml/2006/main" noChangeAspect="1"/>
+            </wp:cNvGraphicFramePr>
+            <a:graphic xmlns:a="http://schemas.openxmlformats.org/drawingml/2006/main">
+              <a:graphicData uri="http://schemas.openxmlformats.org/drawingml/2006/picture">
+                <pic:pic xmlns:pic="http://schemas.openxmlformats.org/drawingml/2006/picture">
+                  <pic:nvPicPr>
+                    <pic:cNvPr id="1160088160" name="Picture 1" descr="A screen shot of a computer program&#10;&#10;AI-generated content may be incorrect."/>
+                    <pic:cNvPicPr/>
+                  </pic:nvPicPr>
+                  <pic:blipFill>
+                    <a:blip r:embed="rId42"/>
+                    <a:stretch>
+                      <a:fillRect/>
+                    </a:stretch>
+                  </pic:blipFill>
+                  <pic:spPr>
+                    <a:xfrm>
+                      <a:off x="0" y="0"/>
+                      <a:ext cx="3074478" cy="2466278"/>
+                    </a:xfrm>
+                    <a:prstGeom prst="rect">
+                      <a:avLst/>
+                    </a:prstGeom>
+                  </pic:spPr>
+                </pic:pic>
+              </a:graphicData>
+            </a:graphic>
+          </wp:inline>
+        </w:drawing>
+      </w:r>
+      <w:r>
+        <w:rPr>
+          <w:noProof/>
+        </w:rPr>
+        <w:drawing>
+          <wp:inline distT="0" distB="0" distL="0" distR="0" wp14:anchorId="631FFEB9" wp14:editId="40853F7E">
+            <wp:extent cx="2840329" cy="2494422"/>
+            <wp:effectExtent l="0" t="0" r="0" b="1270"/>
+            <wp:docPr id="2017674889" name="Picture 1" descr="A computer screen shot of a program code&#10;&#10;AI-generated content may be incorrect."/>
+            <wp:cNvGraphicFramePr>
+              <a:graphicFrameLocks xmlns:a="http://schemas.openxmlformats.org/drawingml/2006/main" noChangeAspect="1"/>
+            </wp:cNvGraphicFramePr>
+            <a:graphic xmlns:a="http://schemas.openxmlformats.org/drawingml/2006/main">
+              <a:graphicData uri="http://schemas.openxmlformats.org/drawingml/2006/picture">
+                <pic:pic xmlns:pic="http://schemas.openxmlformats.org/drawingml/2006/picture">
+                  <pic:nvPicPr>
+                    <pic:cNvPr id="2017674889" name="Picture 1" descr="A computer screen shot of a program code&#10;&#10;AI-generated content may be incorrect."/>
+                    <pic:cNvPicPr/>
+                  </pic:nvPicPr>
+                  <pic:blipFill>
+                    <a:blip r:embed="rId43"/>
+                    <a:stretch>
+                      <a:fillRect/>
+                    </a:stretch>
+                  </pic:blipFill>
+                  <pic:spPr>
+                    <a:xfrm>
+                      <a:off x="0" y="0"/>
+                      <a:ext cx="2853839" cy="2506287"/>
+                    </a:xfrm>
+                    <a:prstGeom prst="rect">
+                      <a:avLst/>
+                    </a:prstGeom>
+                  </pic:spPr>
+                </pic:pic>
+              </a:graphicData>
+            </a:graphic>
+          </wp:inline>
+        </w:drawing>
+      </w:r>
+    </w:p>
+    <w:p>
+      <w:pPr>
+        <w:rPr>
+          <w:sz w:val="40"/>
+          <w:szCs w:val="40"/>
+        </w:rPr>
+      </w:pPr>
+      <w:r>
+        <w:rPr>
+          <w:noProof/>
+        </w:rPr>
+        <w:drawing>
+          <wp:inline distT="0" distB="0" distL="0" distR="0" wp14:anchorId="503B608D" wp14:editId="4F4C2CE4">
+            <wp:extent cx="1965278" cy="636065"/>
+            <wp:effectExtent l="0" t="0" r="0" b="0"/>
+            <wp:docPr id="756382446" name="Picture 1" descr="A black screen with white text&#10;&#10;AI-generated content may be incorrect."/>
+            <wp:cNvGraphicFramePr>
+              <a:graphicFrameLocks xmlns:a="http://schemas.openxmlformats.org/drawingml/2006/main" noChangeAspect="1"/>
+            </wp:cNvGraphicFramePr>
+            <a:graphic xmlns:a="http://schemas.openxmlformats.org/drawingml/2006/main">
+              <a:graphicData uri="http://schemas.openxmlformats.org/drawingml/2006/picture">
+                <pic:pic xmlns:pic="http://schemas.openxmlformats.org/drawingml/2006/picture">
+                  <pic:nvPicPr>
+                    <pic:cNvPr id="756382446" name="Picture 1" descr="A black screen with white text&#10;&#10;AI-generated content may be incorrect."/>
+                    <pic:cNvPicPr/>
+                  </pic:nvPicPr>
+                  <pic:blipFill>
+                    <a:blip r:embed="rId44"/>
+                    <a:stretch>
+                      <a:fillRect/>
+                    </a:stretch>
+                  </pic:blipFill>
+                  <pic:spPr>
+                    <a:xfrm>
+                      <a:off x="0" y="0"/>
+                      <a:ext cx="1973805" cy="638825"/>
+                    </a:xfrm>
+                    <a:prstGeom prst="rect">
+                      <a:avLst/>
+                    </a:prstGeom>
+                  </pic:spPr>
+                </pic:pic>
+              </a:graphicData>
+            </a:graphic>
+          </wp:inline>
+        </w:drawing>
+      </w:r>
+    </w:p>
+    <w:p>
+      <w:pPr>
+        <w:rPr>
+          <w:sz w:val="40"/>
+          <w:szCs w:val="40"/>
+        </w:rPr>
+      </w:pPr>
+      <w:r>
+        <w:rPr>
+          <w:sz w:val="40"/>
+          <w:szCs w:val="40"/>
+        </w:rPr>
+        <w:t>+Protect a Route</w:t>
+      </w:r>
+    </w:p>
+    <w:p>
+      <w:pPr>
+        <w:rPr>
+          <w:sz w:val="40"/>
+          <w:szCs w:val="40"/>
+        </w:rPr>
+      </w:pPr>
+      <w:r>
+        <w:rPr>
+          <w:noProof/>
+        </w:rPr>
+        <w:drawing>
+          <wp:inline distT="0" distB="0" distL="0" distR="0" wp14:anchorId="728444B3" wp14:editId="1278B95E">
+            <wp:extent cx="2883141" cy="2299648"/>
+            <wp:effectExtent l="0" t="0" r="0" b="5715"/>
+            <wp:docPr id="284013388" name="Picture 1" descr="A screen shot of a computer program&#10;&#10;AI-generated content may be incorrect."/>
+            <wp:cNvGraphicFramePr>
+              <a:graphicFrameLocks xmlns:a="http://schemas.openxmlformats.org/drawingml/2006/main" noChangeAspect="1"/>
+            </wp:cNvGraphicFramePr>
+            <a:graphic xmlns:a="http://schemas.openxmlformats.org/drawingml/2006/main">
+              <a:graphicData uri="http://schemas.openxmlformats.org/drawingml/2006/picture">
+                <pic:pic xmlns:pic="http://schemas.openxmlformats.org/drawingml/2006/picture">
+                  <pic:nvPicPr>
+                    <pic:cNvPr id="284013388" name="Picture 1" descr="A screen shot of a computer program&#10;&#10;AI-generated content may be incorrect."/>
+                    <pic:cNvPicPr/>
+                  </pic:nvPicPr>
+                  <pic:blipFill>
+                    <a:blip r:embed="rId45"/>
+                    <a:stretch>
+                      <a:fillRect/>
+                    </a:stretch>
+                  </pic:blipFill>
+                  <pic:spPr>
+                    <a:xfrm>
+                      <a:off x="0" y="0"/>
+                      <a:ext cx="2886030" cy="2301952"/>
+                    </a:xfrm>
+                    <a:prstGeom prst="rect">
+                      <a:avLst/>
+                    </a:prstGeom>
+                  </pic:spPr>
+                </pic:pic>
+              </a:graphicData>
+            </a:graphic>
+          </wp:inline>
+        </w:drawing>
+      </w:r>
+      <w:r>
+        <w:rPr>
+          <w:noProof/>
+        </w:rPr>
+        <w:drawing>
+          <wp:inline distT="0" distB="0" distL="0" distR="0" wp14:anchorId="3003FDFF" wp14:editId="5ED1DADE">
+            <wp:extent cx="1406948" cy="1248770"/>
+            <wp:effectExtent l="0" t="0" r="3175" b="8890"/>
+            <wp:docPr id="2103889894" name="Picture 1" descr="A screen shot of a computer code&#10;&#10;AI-generated content may be incorrect."/>
+            <wp:cNvGraphicFramePr>
+              <a:graphicFrameLocks xmlns:a="http://schemas.openxmlformats.org/drawingml/2006/main" noChangeAspect="1"/>
+            </wp:cNvGraphicFramePr>
+            <a:graphic xmlns:a="http://schemas.openxmlformats.org/drawingml/2006/main">
+              <a:graphicData uri="http://schemas.openxmlformats.org/drawingml/2006/picture">
+                <pic:pic xmlns:pic="http://schemas.openxmlformats.org/drawingml/2006/picture">
+                  <pic:nvPicPr>
+                    <pic:cNvPr id="2103889894" name="Picture 1" descr="A screen shot of a computer code&#10;&#10;AI-generated content may be incorrect."/>
+                    <pic:cNvPicPr/>
+                  </pic:nvPicPr>
+                  <pic:blipFill>
+                    <a:blip r:embed="rId46"/>
+                    <a:stretch>
+                      <a:fillRect/>
+                    </a:stretch>
+                  </pic:blipFill>
+                  <pic:spPr>
+                    <a:xfrm>
+                      <a:off x="0" y="0"/>
+                      <a:ext cx="1409012" cy="1250602"/>
+                    </a:xfrm>
+                    <a:prstGeom prst="rect">
+                      <a:avLst/>
+                    </a:prstGeom>
+                  </pic:spPr>
+                </pic:pic>
+              </a:graphicData>
+            </a:graphic>
+          </wp:inline>
+        </w:drawing>
+      </w:r>
     </w:p>
     <w:sectPr>
       <w:pgSz w:w="12240" w:h="15840"/>

</xml_diff>

<commit_message>
Ultimate React Course: complete section 19
</commit_message>
<xml_diff>
--- a/3.React/UltimateReactCourse/Document/3.docx
+++ b/3.React/UltimateReactCourse/Document/3.docx
@@ -14,7 +14,32 @@
           <w:sz w:val="40"/>
           <w:szCs w:val="40"/>
         </w:rPr>
-        <w:t xml:space="preserve">-useRedudcer(): </w:t>
+        <w:t>-</w:t>
+      </w:r>
+      <w:proofErr w:type="spellStart"/>
+      <w:proofErr w:type="gramStart"/>
+      <w:r>
+        <w:rPr>
+          <w:sz w:val="40"/>
+          <w:szCs w:val="40"/>
+        </w:rPr>
+        <w:t>useRedudcer</w:t>
+      </w:r>
+      <w:proofErr w:type="spellEnd"/>
+      <w:r>
+        <w:rPr>
+          <w:sz w:val="40"/>
+          <w:szCs w:val="40"/>
+        </w:rPr>
+        <w:t>(</w:t>
+      </w:r>
+      <w:proofErr w:type="gramEnd"/>
+      <w:r>
+        <w:rPr>
+          <w:sz w:val="40"/>
+          <w:szCs w:val="40"/>
+        </w:rPr>
+        <w:t xml:space="preserve">): </w:t>
       </w:r>
     </w:p>
     <w:p>
@@ -257,21 +282,46 @@
           <w:sz w:val="40"/>
           <w:szCs w:val="40"/>
         </w:rPr>
-        <w:t>+Fake data questions: data/questions.json</w:t>
-      </w:r>
-    </w:p>
-    <w:p>
-      <w:pPr>
-        <w:rPr>
-          <w:noProof/>
-        </w:rPr>
-      </w:pPr>
-      <w:r>
-        <w:rPr>
-          <w:sz w:val="40"/>
-          <w:szCs w:val="40"/>
-        </w:rPr>
-        <w:t>+Install json-server:</w:t>
+        <w:t>+Fake data questions: data/</w:t>
+      </w:r>
+      <w:proofErr w:type="spellStart"/>
+      <w:r>
+        <w:rPr>
+          <w:sz w:val="40"/>
+          <w:szCs w:val="40"/>
+        </w:rPr>
+        <w:t>questions.json</w:t>
+      </w:r>
+      <w:proofErr w:type="spellEnd"/>
+    </w:p>
+    <w:p>
+      <w:pPr>
+        <w:rPr>
+          <w:noProof/>
+        </w:rPr>
+      </w:pPr>
+      <w:r>
+        <w:rPr>
+          <w:sz w:val="40"/>
+          <w:szCs w:val="40"/>
+        </w:rPr>
+        <w:t xml:space="preserve">+Install </w:t>
+      </w:r>
+      <w:proofErr w:type="spellStart"/>
+      <w:r>
+        <w:rPr>
+          <w:sz w:val="40"/>
+          <w:szCs w:val="40"/>
+        </w:rPr>
+        <w:t>json</w:t>
+      </w:r>
+      <w:proofErr w:type="spellEnd"/>
+      <w:r>
+        <w:rPr>
+          <w:sz w:val="40"/>
+          <w:szCs w:val="40"/>
+        </w:rPr>
+        <w:t>-server:</w:t>
       </w:r>
       <w:r>
         <w:rPr>
@@ -388,7 +438,23 @@
           <w:sz w:val="40"/>
           <w:szCs w:val="40"/>
         </w:rPr>
-        <w:t>And: npm run server</w:t>
+        <w:t xml:space="preserve">And: </w:t>
+      </w:r>
+      <w:proofErr w:type="spellStart"/>
+      <w:r>
+        <w:rPr>
+          <w:sz w:val="40"/>
+          <w:szCs w:val="40"/>
+        </w:rPr>
+        <w:t>npm</w:t>
+      </w:r>
+      <w:proofErr w:type="spellEnd"/>
+      <w:r>
+        <w:rPr>
+          <w:sz w:val="40"/>
+          <w:szCs w:val="40"/>
+        </w:rPr>
+        <w:t xml:space="preserve"> run server</w:t>
       </w:r>
     </w:p>
     <w:tbl>
@@ -740,6 +806,7 @@
         </w:rPr>
         <w:t>+</w:t>
       </w:r>
+      <w:proofErr w:type="spellStart"/>
       <w:r>
         <w:rPr>
           <w:b/>
@@ -749,6 +816,7 @@
         </w:rPr>
         <w:t>BrowserRouter</w:t>
       </w:r>
+      <w:proofErr w:type="spellEnd"/>
     </w:p>
     <w:p>
       <w:pPr>
@@ -826,7 +894,23 @@
           <w:sz w:val="40"/>
           <w:szCs w:val="40"/>
         </w:rPr>
-        <w:t>+Use &lt;Link&gt; or &lt;NavLink&gt;</w:t>
+        <w:t>+Use &lt;Link&gt; or &lt;</w:t>
+      </w:r>
+      <w:proofErr w:type="spellStart"/>
+      <w:r>
+        <w:rPr>
+          <w:sz w:val="40"/>
+          <w:szCs w:val="40"/>
+        </w:rPr>
+        <w:t>NavLink</w:t>
+      </w:r>
+      <w:proofErr w:type="spellEnd"/>
+      <w:r>
+        <w:rPr>
+          <w:sz w:val="40"/>
+          <w:szCs w:val="40"/>
+        </w:rPr>
+        <w:t>&gt;</w:t>
       </w:r>
     </w:p>
     <w:p>
@@ -1291,13 +1375,33 @@
         </w:rPr>
         <w:t xml:space="preserve"> </w:t>
       </w:r>
+      <w:proofErr w:type="spellStart"/>
+      <w:proofErr w:type="gramStart"/>
       <w:r>
         <w:rPr>
           <w:b/>
           <w:sz w:val="40"/>
           <w:szCs w:val="40"/>
         </w:rPr>
-        <w:t>useNavigate()</w:t>
+        <w:t>useNavigate</w:t>
+      </w:r>
+      <w:proofErr w:type="spellEnd"/>
+      <w:r>
+        <w:rPr>
+          <w:b/>
+          <w:sz w:val="40"/>
+          <w:szCs w:val="40"/>
+        </w:rPr>
+        <w:t>(</w:t>
+      </w:r>
+      <w:proofErr w:type="gramEnd"/>
+      <w:r>
+        <w:rPr>
+          <w:b/>
+          <w:sz w:val="40"/>
+          <w:szCs w:val="40"/>
+        </w:rPr>
+        <w:t>)</w:t>
       </w:r>
     </w:p>
     <w:p>
@@ -1704,7 +1808,23 @@
           <w:sz w:val="40"/>
           <w:szCs w:val="40"/>
         </w:rPr>
-        <w:t>Create PostContext.jsx:</w:t>
+        <w:t xml:space="preserve">Create </w:t>
+      </w:r>
+      <w:proofErr w:type="spellStart"/>
+      <w:r>
+        <w:rPr>
+          <w:sz w:val="40"/>
+          <w:szCs w:val="40"/>
+        </w:rPr>
+        <w:t>PostContext.jsx</w:t>
+      </w:r>
+      <w:proofErr w:type="spellEnd"/>
+      <w:r>
+        <w:rPr>
+          <w:sz w:val="40"/>
+          <w:szCs w:val="40"/>
+        </w:rPr>
+        <w:t>:</w:t>
       </w:r>
     </w:p>
     <w:p>
@@ -1864,7 +1984,23 @@
           <w:sz w:val="40"/>
           <w:szCs w:val="40"/>
         </w:rPr>
-        <w:t>Then used context in App.jsx:</w:t>
+        <w:t xml:space="preserve">Then used context in </w:t>
+      </w:r>
+      <w:proofErr w:type="spellStart"/>
+      <w:r>
+        <w:rPr>
+          <w:sz w:val="40"/>
+          <w:szCs w:val="40"/>
+        </w:rPr>
+        <w:t>App.jsx</w:t>
+      </w:r>
+      <w:proofErr w:type="spellEnd"/>
+      <w:r>
+        <w:rPr>
+          <w:sz w:val="40"/>
+          <w:szCs w:val="40"/>
+        </w:rPr>
+        <w:t>:</w:t>
       </w:r>
     </w:p>
     <w:p>
@@ -2349,7 +2485,32 @@
           <w:sz w:val="40"/>
           <w:szCs w:val="40"/>
         </w:rPr>
-        <w:t>-Advanced State Management System: Context + useReducer()</w:t>
+        <w:t xml:space="preserve">-Advanced State Management System: Context + </w:t>
+      </w:r>
+      <w:proofErr w:type="spellStart"/>
+      <w:proofErr w:type="gramStart"/>
+      <w:r>
+        <w:rPr>
+          <w:sz w:val="40"/>
+          <w:szCs w:val="40"/>
+        </w:rPr>
+        <w:t>useReducer</w:t>
+      </w:r>
+      <w:proofErr w:type="spellEnd"/>
+      <w:r>
+        <w:rPr>
+          <w:sz w:val="40"/>
+          <w:szCs w:val="40"/>
+        </w:rPr>
+        <w:t>(</w:t>
+      </w:r>
+      <w:proofErr w:type="gramEnd"/>
+      <w:r>
+        <w:rPr>
+          <w:sz w:val="40"/>
+          <w:szCs w:val="40"/>
+        </w:rPr>
+        <w:t>)</w:t>
       </w:r>
     </w:p>
     <w:p>
@@ -2876,6 +3037,499 @@
             </a:graphic>
           </wp:inline>
         </w:drawing>
+      </w:r>
+    </w:p>
+    <w:p>
+      <w:pPr>
+        <w:rPr>
+          <w:sz w:val="40"/>
+          <w:szCs w:val="40"/>
+        </w:rPr>
+      </w:pPr>
+      <w:r>
+        <w:rPr>
+          <w:sz w:val="40"/>
+          <w:szCs w:val="40"/>
+        </w:rPr>
+        <w:t>-memo:</w:t>
+      </w:r>
+    </w:p>
+    <w:p>
+      <w:pPr>
+        <w:rPr>
+          <w:sz w:val="40"/>
+          <w:szCs w:val="40"/>
+        </w:rPr>
+      </w:pPr>
+      <w:r>
+        <w:rPr>
+          <w:noProof/>
+        </w:rPr>
+        <w:drawing>
+          <wp:inline distT="0" distB="0" distL="0" distR="0" wp14:anchorId="682FDCE2" wp14:editId="40C17080">
+            <wp:extent cx="3848669" cy="1472595"/>
+            <wp:effectExtent l="0" t="0" r="0" b="0"/>
+            <wp:docPr id="999664146" name="Picture 1" descr="A screen shot of a computer program&#10;&#10;AI-generated content may be incorrect."/>
+            <wp:cNvGraphicFramePr>
+              <a:graphicFrameLocks xmlns:a="http://schemas.openxmlformats.org/drawingml/2006/main" noChangeAspect="1"/>
+            </wp:cNvGraphicFramePr>
+            <a:graphic xmlns:a="http://schemas.openxmlformats.org/drawingml/2006/main">
+              <a:graphicData uri="http://schemas.openxmlformats.org/drawingml/2006/picture">
+                <pic:pic xmlns:pic="http://schemas.openxmlformats.org/drawingml/2006/picture">
+                  <pic:nvPicPr>
+                    <pic:cNvPr id="999664146" name="Picture 1" descr="A screen shot of a computer program&#10;&#10;AI-generated content may be incorrect."/>
+                    <pic:cNvPicPr/>
+                  </pic:nvPicPr>
+                  <pic:blipFill>
+                    <a:blip r:embed="rId47"/>
+                    <a:stretch>
+                      <a:fillRect/>
+                    </a:stretch>
+                  </pic:blipFill>
+                  <pic:spPr>
+                    <a:xfrm>
+                      <a:off x="0" y="0"/>
+                      <a:ext cx="3861673" cy="1477571"/>
+                    </a:xfrm>
+                    <a:prstGeom prst="rect">
+                      <a:avLst/>
+                    </a:prstGeom>
+                  </pic:spPr>
+                </pic:pic>
+              </a:graphicData>
+            </a:graphic>
+          </wp:inline>
+        </w:drawing>
+      </w:r>
+    </w:p>
+    <w:p>
+      <w:pPr>
+        <w:rPr>
+          <w:sz w:val="40"/>
+          <w:szCs w:val="40"/>
+        </w:rPr>
+      </w:pPr>
+      <w:r>
+        <w:rPr>
+          <w:sz w:val="40"/>
+          <w:szCs w:val="40"/>
+        </w:rPr>
+        <w:lastRenderedPageBreak/>
+        <w:t>-</w:t>
+      </w:r>
+      <w:proofErr w:type="spellStart"/>
+      <w:proofErr w:type="gramStart"/>
+      <w:r>
+        <w:rPr>
+          <w:sz w:val="40"/>
+          <w:szCs w:val="40"/>
+        </w:rPr>
+        <w:t>useMemo</w:t>
+      </w:r>
+      <w:proofErr w:type="spellEnd"/>
+      <w:r>
+        <w:rPr>
+          <w:sz w:val="40"/>
+          <w:szCs w:val="40"/>
+        </w:rPr>
+        <w:t>(</w:t>
+      </w:r>
+      <w:proofErr w:type="gramEnd"/>
+      <w:r>
+        <w:rPr>
+          <w:sz w:val="40"/>
+          <w:szCs w:val="40"/>
+        </w:rPr>
+        <w:t>):</w:t>
+      </w:r>
+    </w:p>
+    <w:p>
+      <w:pPr>
+        <w:rPr>
+          <w:sz w:val="40"/>
+          <w:szCs w:val="40"/>
+        </w:rPr>
+      </w:pPr>
+      <w:r>
+        <w:rPr>
+          <w:noProof/>
+        </w:rPr>
+        <w:drawing>
+          <wp:inline distT="0" distB="0" distL="0" distR="0" wp14:anchorId="28ACAA84" wp14:editId="0F60DCE1">
+            <wp:extent cx="4490113" cy="976857"/>
+            <wp:effectExtent l="0" t="0" r="5715" b="0"/>
+            <wp:docPr id="1930402597" name="Picture 1" descr="A black screen with text and symbols&#10;&#10;AI-generated content may be incorrect."/>
+            <wp:cNvGraphicFramePr>
+              <a:graphicFrameLocks xmlns:a="http://schemas.openxmlformats.org/drawingml/2006/main" noChangeAspect="1"/>
+            </wp:cNvGraphicFramePr>
+            <a:graphic xmlns:a="http://schemas.openxmlformats.org/drawingml/2006/main">
+              <a:graphicData uri="http://schemas.openxmlformats.org/drawingml/2006/picture">
+                <pic:pic xmlns:pic="http://schemas.openxmlformats.org/drawingml/2006/picture">
+                  <pic:nvPicPr>
+                    <pic:cNvPr id="1930402597" name="Picture 1" descr="A black screen with text and symbols&#10;&#10;AI-generated content may be incorrect."/>
+                    <pic:cNvPicPr/>
+                  </pic:nvPicPr>
+                  <pic:blipFill>
+                    <a:blip r:embed="rId48"/>
+                    <a:stretch>
+                      <a:fillRect/>
+                    </a:stretch>
+                  </pic:blipFill>
+                  <pic:spPr>
+                    <a:xfrm>
+                      <a:off x="0" y="0"/>
+                      <a:ext cx="4501791" cy="979398"/>
+                    </a:xfrm>
+                    <a:prstGeom prst="rect">
+                      <a:avLst/>
+                    </a:prstGeom>
+                  </pic:spPr>
+                </pic:pic>
+              </a:graphicData>
+            </a:graphic>
+          </wp:inline>
+        </w:drawing>
+      </w:r>
+    </w:p>
+    <w:p>
+      <w:pPr>
+        <w:rPr>
+          <w:sz w:val="40"/>
+          <w:szCs w:val="40"/>
+        </w:rPr>
+      </w:pPr>
+      <w:r>
+        <w:rPr>
+          <w:sz w:val="40"/>
+          <w:szCs w:val="40"/>
+        </w:rPr>
+        <w:t>-</w:t>
+      </w:r>
+      <w:proofErr w:type="spellStart"/>
+      <w:proofErr w:type="gramStart"/>
+      <w:r>
+        <w:rPr>
+          <w:sz w:val="40"/>
+          <w:szCs w:val="40"/>
+        </w:rPr>
+        <w:t>useCallback</w:t>
+      </w:r>
+      <w:proofErr w:type="spellEnd"/>
+      <w:r>
+        <w:rPr>
+          <w:sz w:val="40"/>
+          <w:szCs w:val="40"/>
+        </w:rPr>
+        <w:t>(</w:t>
+      </w:r>
+      <w:proofErr w:type="gramEnd"/>
+      <w:r>
+        <w:rPr>
+          <w:sz w:val="40"/>
+          <w:szCs w:val="40"/>
+        </w:rPr>
+        <w:t>):</w:t>
+      </w:r>
+    </w:p>
+    <w:p>
+      <w:pPr>
+        <w:rPr>
+          <w:sz w:val="40"/>
+          <w:szCs w:val="40"/>
+        </w:rPr>
+      </w:pPr>
+      <w:r>
+        <w:rPr>
+          <w:noProof/>
+        </w:rPr>
+        <w:drawing>
+          <wp:inline distT="0" distB="0" distL="0" distR="0" wp14:anchorId="320B7349" wp14:editId="271DBF90">
+            <wp:extent cx="4714875" cy="533400"/>
+            <wp:effectExtent l="0" t="0" r="9525" b="0"/>
+            <wp:docPr id="2082643416" name="Picture 1" descr="A black background with white text&#10;&#10;AI-generated content may be incorrect."/>
+            <wp:cNvGraphicFramePr>
+              <a:graphicFrameLocks xmlns:a="http://schemas.openxmlformats.org/drawingml/2006/main" noChangeAspect="1"/>
+            </wp:cNvGraphicFramePr>
+            <a:graphic xmlns:a="http://schemas.openxmlformats.org/drawingml/2006/main">
+              <a:graphicData uri="http://schemas.openxmlformats.org/drawingml/2006/picture">
+                <pic:pic xmlns:pic="http://schemas.openxmlformats.org/drawingml/2006/picture">
+                  <pic:nvPicPr>
+                    <pic:cNvPr id="2082643416" name="Picture 1" descr="A black background with white text&#10;&#10;AI-generated content may be incorrect."/>
+                    <pic:cNvPicPr/>
+                  </pic:nvPicPr>
+                  <pic:blipFill>
+                    <a:blip r:embed="rId49"/>
+                    <a:stretch>
+                      <a:fillRect/>
+                    </a:stretch>
+                  </pic:blipFill>
+                  <pic:spPr>
+                    <a:xfrm>
+                      <a:off x="0" y="0"/>
+                      <a:ext cx="4714875" cy="533400"/>
+                    </a:xfrm>
+                    <a:prstGeom prst="rect">
+                      <a:avLst/>
+                    </a:prstGeom>
+                  </pic:spPr>
+                </pic:pic>
+              </a:graphicData>
+            </a:graphic>
+          </wp:inline>
+        </w:drawing>
+      </w:r>
+    </w:p>
+    <w:p>
+      <w:pPr>
+        <w:rPr>
+          <w:sz w:val="40"/>
+          <w:szCs w:val="40"/>
+        </w:rPr>
+      </w:pPr>
+      <w:r>
+        <w:rPr>
+          <w:sz w:val="40"/>
+          <w:szCs w:val="40"/>
+        </w:rPr>
+        <w:t>-Optimize Context Re-renders</w:t>
+      </w:r>
+    </w:p>
+    <w:p>
+      <w:pPr>
+        <w:rPr>
+          <w:sz w:val="40"/>
+          <w:szCs w:val="40"/>
+        </w:rPr>
+      </w:pPr>
+      <w:r>
+        <w:rPr>
+          <w:noProof/>
+        </w:rPr>
+        <w:drawing>
+          <wp:inline distT="0" distB="0" distL="0" distR="0" wp14:anchorId="0B15A941" wp14:editId="04BBC5B5">
+            <wp:extent cx="4128448" cy="2124416"/>
+            <wp:effectExtent l="0" t="0" r="5715" b="9525"/>
+            <wp:docPr id="962537668" name="Picture 1" descr="A computer screen shot of a program code&#10;&#10;AI-generated content may be incorrect."/>
+            <wp:cNvGraphicFramePr>
+              <a:graphicFrameLocks xmlns:a="http://schemas.openxmlformats.org/drawingml/2006/main" noChangeAspect="1"/>
+            </wp:cNvGraphicFramePr>
+            <a:graphic xmlns:a="http://schemas.openxmlformats.org/drawingml/2006/main">
+              <a:graphicData uri="http://schemas.openxmlformats.org/drawingml/2006/picture">
+                <pic:pic xmlns:pic="http://schemas.openxmlformats.org/drawingml/2006/picture">
+                  <pic:nvPicPr>
+                    <pic:cNvPr id="962537668" name="Picture 1" descr="A computer screen shot of a program code&#10;&#10;AI-generated content may be incorrect."/>
+                    <pic:cNvPicPr/>
+                  </pic:nvPicPr>
+                  <pic:blipFill>
+                    <a:blip r:embed="rId50"/>
+                    <a:stretch>
+                      <a:fillRect/>
+                    </a:stretch>
+                  </pic:blipFill>
+                  <pic:spPr>
+                    <a:xfrm>
+                      <a:off x="0" y="0"/>
+                      <a:ext cx="4150627" cy="2135829"/>
+                    </a:xfrm>
+                    <a:prstGeom prst="rect">
+                      <a:avLst/>
+                    </a:prstGeom>
+                  </pic:spPr>
+                </pic:pic>
+              </a:graphicData>
+            </a:graphic>
+          </wp:inline>
+        </w:drawing>
+      </w:r>
+    </w:p>
+    <w:p>
+      <w:pPr>
+        <w:rPr>
+          <w:sz w:val="40"/>
+          <w:szCs w:val="40"/>
+        </w:rPr>
+      </w:pPr>
+      <w:r>
+        <w:rPr>
+          <w:noProof/>
+        </w:rPr>
+        <w:drawing>
+          <wp:inline distT="0" distB="0" distL="0" distR="0" wp14:anchorId="403071BC" wp14:editId="70A43C45">
+            <wp:extent cx="2272352" cy="1257759"/>
+            <wp:effectExtent l="0" t="0" r="0" b="0"/>
+            <wp:docPr id="165150117" name="Picture 1" descr="A computer screen shot of a program code&#10;&#10;AI-generated content may be incorrect."/>
+            <wp:cNvGraphicFramePr>
+              <a:graphicFrameLocks xmlns:a="http://schemas.openxmlformats.org/drawingml/2006/main" noChangeAspect="1"/>
+            </wp:cNvGraphicFramePr>
+            <a:graphic xmlns:a="http://schemas.openxmlformats.org/drawingml/2006/main">
+              <a:graphicData uri="http://schemas.openxmlformats.org/drawingml/2006/picture">
+                <pic:pic xmlns:pic="http://schemas.openxmlformats.org/drawingml/2006/picture">
+                  <pic:nvPicPr>
+                    <pic:cNvPr id="165150117" name="Picture 1" descr="A computer screen shot of a program code&#10;&#10;AI-generated content may be incorrect."/>
+                    <pic:cNvPicPr/>
+                  </pic:nvPicPr>
+                  <pic:blipFill>
+                    <a:blip r:embed="rId51"/>
+                    <a:stretch>
+                      <a:fillRect/>
+                    </a:stretch>
+                  </pic:blipFill>
+                  <pic:spPr>
+                    <a:xfrm>
+                      <a:off x="0" y="0"/>
+                      <a:ext cx="2281587" cy="1262871"/>
+                    </a:xfrm>
+                    <a:prstGeom prst="rect">
+                      <a:avLst/>
+                    </a:prstGeom>
+                  </pic:spPr>
+                </pic:pic>
+              </a:graphicData>
+            </a:graphic>
+          </wp:inline>
+        </w:drawing>
+      </w:r>
+    </w:p>
+    <w:p>
+      <w:pPr>
+        <w:rPr>
+          <w:sz w:val="40"/>
+          <w:szCs w:val="40"/>
+        </w:rPr>
+      </w:pPr>
+      <w:r>
+        <w:rPr>
+          <w:sz w:val="40"/>
+          <w:szCs w:val="40"/>
+        </w:rPr>
+        <w:t>-Optimize Bundle Size with code splitting</w:t>
+      </w:r>
+    </w:p>
+    <w:p>
+      <w:pPr>
+        <w:rPr>
+          <w:sz w:val="40"/>
+          <w:szCs w:val="40"/>
+        </w:rPr>
+      </w:pPr>
+      <w:r>
+        <w:rPr>
+          <w:noProof/>
+        </w:rPr>
+        <w:drawing>
+          <wp:inline distT="0" distB="0" distL="0" distR="0" wp14:anchorId="06CD99DE" wp14:editId="33F21451">
+            <wp:extent cx="3828197" cy="889380"/>
+            <wp:effectExtent l="0" t="0" r="1270" b="6350"/>
+            <wp:docPr id="2091069024" name="Picture 1" descr="A screen shot of a computer code&#10;&#10;AI-generated content may be incorrect."/>
+            <wp:cNvGraphicFramePr>
+              <a:graphicFrameLocks xmlns:a="http://schemas.openxmlformats.org/drawingml/2006/main" noChangeAspect="1"/>
+            </wp:cNvGraphicFramePr>
+            <a:graphic xmlns:a="http://schemas.openxmlformats.org/drawingml/2006/main">
+              <a:graphicData uri="http://schemas.openxmlformats.org/drawingml/2006/picture">
+                <pic:pic xmlns:pic="http://schemas.openxmlformats.org/drawingml/2006/picture">
+                  <pic:nvPicPr>
+                    <pic:cNvPr id="2091069024" name="Picture 1" descr="A screen shot of a computer code&#10;&#10;AI-generated content may be incorrect."/>
+                    <pic:cNvPicPr/>
+                  </pic:nvPicPr>
+                  <pic:blipFill>
+                    <a:blip r:embed="rId52"/>
+                    <a:stretch>
+                      <a:fillRect/>
+                    </a:stretch>
+                  </pic:blipFill>
+                  <pic:spPr>
+                    <a:xfrm>
+                      <a:off x="0" y="0"/>
+                      <a:ext cx="3860334" cy="896846"/>
+                    </a:xfrm>
+                    <a:prstGeom prst="rect">
+                      <a:avLst/>
+                    </a:prstGeom>
+                  </pic:spPr>
+                </pic:pic>
+              </a:graphicData>
+            </a:graphic>
+          </wp:inline>
+        </w:drawing>
+      </w:r>
+    </w:p>
+    <w:p>
+      <w:pPr>
+        <w:rPr>
+          <w:sz w:val="40"/>
+          <w:szCs w:val="40"/>
+        </w:rPr>
+      </w:pPr>
+      <w:r>
+        <w:rPr>
+          <w:noProof/>
+        </w:rPr>
+        <w:lastRenderedPageBreak/>
+        <w:drawing>
+          <wp:inline distT="0" distB="0" distL="0" distR="0" wp14:anchorId="3A11A825" wp14:editId="394950F9">
+            <wp:extent cx="3200400" cy="552450"/>
+            <wp:effectExtent l="0" t="0" r="0" b="0"/>
+            <wp:docPr id="1380691017" name="Picture 1" descr="A computer screen shot of a black background&#10;&#10;AI-generated content may be incorrect."/>
+            <wp:cNvGraphicFramePr>
+              <a:graphicFrameLocks xmlns:a="http://schemas.openxmlformats.org/drawingml/2006/main" noChangeAspect="1"/>
+            </wp:cNvGraphicFramePr>
+            <a:graphic xmlns:a="http://schemas.openxmlformats.org/drawingml/2006/main">
+              <a:graphicData uri="http://schemas.openxmlformats.org/drawingml/2006/picture">
+                <pic:pic xmlns:pic="http://schemas.openxmlformats.org/drawingml/2006/picture">
+                  <pic:nvPicPr>
+                    <pic:cNvPr id="1380691017" name="Picture 1" descr="A computer screen shot of a black background&#10;&#10;AI-generated content may be incorrect."/>
+                    <pic:cNvPicPr/>
+                  </pic:nvPicPr>
+                  <pic:blipFill>
+                    <a:blip r:embed="rId53"/>
+                    <a:stretch>
+                      <a:fillRect/>
+                    </a:stretch>
+                  </pic:blipFill>
+                  <pic:spPr>
+                    <a:xfrm>
+                      <a:off x="0" y="0"/>
+                      <a:ext cx="3200400" cy="552450"/>
+                    </a:xfrm>
+                    <a:prstGeom prst="rect">
+                      <a:avLst/>
+                    </a:prstGeom>
+                  </pic:spPr>
+                </pic:pic>
+              </a:graphicData>
+            </a:graphic>
+          </wp:inline>
+        </w:drawing>
+      </w:r>
+    </w:p>
+    <w:p>
+      <w:pPr>
+        <w:rPr>
+          <w:sz w:val="40"/>
+          <w:szCs w:val="40"/>
+        </w:rPr>
+      </w:pPr>
+      <w:r>
+        <w:rPr>
+          <w:sz w:val="40"/>
+          <w:szCs w:val="40"/>
+        </w:rPr>
+        <w:t>-Closures in Effects</w:t>
+      </w:r>
+    </w:p>
+    <w:p>
+      <w:pPr>
+        <w:rPr>
+          <w:sz w:val="40"/>
+          <w:szCs w:val="40"/>
+        </w:rPr>
+      </w:pPr>
+      <w:r>
+        <w:rPr>
+          <w:sz w:val="40"/>
+          <w:szCs w:val="40"/>
+        </w:rPr>
+        <w:t>https://dev.to/wildboar_developer/understanding-stale-closure-in-react-a-common-pitfall-and-how-to-avoid-it-5dih</w:t>
       </w:r>
     </w:p>
     <w:sectPr>
@@ -3290,7 +3944,6 @@
   <w:style w:type="character" w:default="1" w:styleId="DefaultParagraphFont">
     <w:name w:val="Default Paragraph Font"/>
     <w:uiPriority w:val="1"/>
-    <w:semiHidden/>
     <w:unhideWhenUsed/>
   </w:style>
   <w:style w:type="table" w:default="1" w:styleId="TableNormal">
@@ -3313,6 +3966,29 @@
     <w:uiPriority w:val="99"/>
     <w:semiHidden/>
     <w:unhideWhenUsed/>
+  </w:style>
+  <w:style w:type="character" w:styleId="Hyperlink">
+    <w:name w:val="Hyperlink"/>
+    <w:basedOn w:val="DefaultParagraphFont"/>
+    <w:uiPriority w:val="99"/>
+    <w:unhideWhenUsed/>
+    <w:rsid w:val="00C0243D"/>
+    <w:rPr>
+      <w:color w:val="0563C1" w:themeColor="hyperlink"/>
+      <w:u w:val="single"/>
+    </w:rPr>
+  </w:style>
+  <w:style w:type="character" w:styleId="UnresolvedMention">
+    <w:name w:val="Unresolved Mention"/>
+    <w:basedOn w:val="DefaultParagraphFont"/>
+    <w:uiPriority w:val="99"/>
+    <w:semiHidden/>
+    <w:unhideWhenUsed/>
+    <w:rsid w:val="00C0243D"/>
+    <w:rPr>
+      <w:color w:val="605E5C"/>
+      <w:shd w:val="clear" w:color="auto" w:fill="E1DFDD"/>
+    </w:rPr>
   </w:style>
 </w:styles>
 </file>

</xml_diff>